<commit_message>
Updated Population Monitoring and added Yuma Cove geographic location clarification.
</commit_message>
<xml_diff>
--- a/PopulationMonitoring.docx
+++ b/PopulationMonitoring.docx
@@ -23,7 +23,7 @@
         <w:pStyle w:val="Date"/>
       </w:pPr>
       <w:r>
-        <w:t xml:space="preserve">2026-08-14</w:t>
+        <w:t xml:space="preserve">2026-08-17</w:t>
       </w:r>
     </w:p>
     <w:sdt>
@@ -121,7 +121,7 @@
         <w:t xml:space="preserve"> </w:t>
       </w:r>
       <w:r>
-        <w:t xml:space="preserve">is a permanent off-channel pond located near Yuma, Arizona (LCR Reach 5). The site has been continuously monitored for Razorback Sucker since an initial stocking of 200 adults (100M/100F) in 2013. Passive PIT scanning infrastructure has been in near-continuous operation since that stocking, providing an exceptionally detailed record of individual fish detection over time. Supplemental stockings occurred in 2014, 2015, 2020, and 2025. The YCB population has been substantially augmented by natural recruitment since at least 2016 and is currently considered one of the more productive RASU OCHs in the LCR network (Marsh et al. 2024; Dowling et al. 2025).</w:t>
+        <w:t xml:space="preserve">is a permanent off-channel pond located at Yuma Cove on Lake Mohave, the reservoir between Hoover and Davis dams on the Colorado River, between Boulder City, Nevada, and Laughlin, Nevada. The backwater was created by construction of an earthen berm across the mouth of Yuma Cove, closing it off from the mainstem reservoir. The site has been continuously monitored for Razorback Sucker since an initial stocking of 200 adults (100M/100F) in 2013. Passive PIT scanning infrastructure has been in near-continuous operation since that stocking, providing an exceptionally detailed record of individual fish detection over time. Supplemental stockings occurred in 2014, 2015, 2020, and 2025. The YCB population has been substantially augmented by natural recruitment since at least 2016 and is currently considered one of the more productive RASU OCHs in the LCR network (Marsh et al. 2024; Dowling et al. 2025).</w:t>
       </w:r>
     </w:p>
     <w:p>

</xml_diff>